<commit_message>
feat(mk-prodi): implement MkProdiController for managing Mata Kuliah Prodi, including CRUD operations and data validation; add migration for t_mk_prodi table and unique constraints; enhance views for data display and interaction
</commit_message>
<xml_diff>
--- a/template/SK-1/form penilaian sk I sd sk III TEMPLATE.docx
+++ b/template/SK-1/form penilaian sk I sd sk III TEMPLATE.docx
@@ -1,6 +1,6 @@
 
 <file path=word/document.xml><?xml version="1.0" encoding="utf-8"?>
-<w:document xmlns:wpc="http://schemas.microsoft.com/office/word/2010/wordprocessingCanvas" xmlns:cx="http://schemas.microsoft.com/office/drawing/2014/chartex" xmlns:cx1="http://schemas.microsoft.com/office/drawing/2015/9/8/chartex" xmlns:cx2="http://schemas.microsoft.com/office/drawing/2015/10/21/chartex" xmlns:cx3="http://schemas.microsoft.com/office/drawing/2016/5/9/chartex" xmlns:cx4="http://schemas.microsoft.com/office/drawing/2016/5/10/chartex" xmlns:cx5="http://schemas.microsoft.com/office/drawing/2016/5/11/chartex" xmlns:cx6="http://schemas.microsoft.com/office/drawing/2016/5/12/chartex" xmlns:cx7="http://schemas.microsoft.com/office/drawing/2016/5/13/chartex" xmlns:cx8="http://schemas.microsoft.com/office/drawing/2016/5/14/chartex" xmlns:mc="http://schemas.openxmlformats.org/markup-compatibility/2006" xmlns:aink="http://schemas.microsoft.com/office/drawing/2016/ink" xmlns:am3d="http://schemas.microsoft.com/office/drawing/2017/model3d" xmlns:o="urn:schemas-microsoft-com:office:office" xmlns:oel="http://schemas.microsoft.com/office/2019/extlst" xmlns:r="http://schemas.openxmlformats.org/officeDocument/2006/relationships" xmlns:m="http://schemas.openxmlformats.org/officeDocument/2006/math" xmlns:v="urn:schemas-microsoft-com:vml" xmlns:wp14="http://schemas.microsoft.com/office/word/2010/wordprocessingDrawing" xmlns:wp="http://schemas.openxmlformats.org/drawingml/2006/wordprocessingDrawing" xmlns:w10="urn:schemas-microsoft-com:office:word" xmlns:w="http://schemas.openxmlformats.org/wordprocessingml/2006/main" xmlns:w14="http://schemas.microsoft.com/office/word/2010/wordml" xmlns:w15="http://schemas.microsoft.com/office/word/2012/wordml" xmlns:w16cex="http://schemas.microsoft.com/office/word/2018/wordml/cex" xmlns:w16cid="http://schemas.microsoft.com/office/word/2016/wordml/cid" xmlns:w16="http://schemas.microsoft.com/office/word/2018/wordml" xmlns:w16du="http://schemas.microsoft.com/office/word/2023/wordml/word16du" xmlns:w16sdtdh="http://schemas.microsoft.com/office/word/2020/wordml/sdtdatahash" xmlns:w16sdtfl="http://schemas.microsoft.com/office/word/2024/wordml/sdtformatlock" xmlns:w16se="http://schemas.microsoft.com/office/word/2015/wordml/symex" xmlns:wpg="http://schemas.microsoft.com/office/word/2010/wordprocessingGroup" xmlns:wpi="http://schemas.microsoft.com/office/word/2010/wordprocessingInk" xmlns:wne="http://schemas.microsoft.com/office/word/2006/wordml" xmlns:wps="http://schemas.microsoft.com/office/word/2010/wordprocessingShape" mc:Ignorable="w14 w15 w16se w16cid w16 w16cex w16sdtdh w16sdtfl w16du wp14">
+<w:document xmlns:wpc="http://schemas.microsoft.com/office/word/2010/wordprocessingCanvas" xmlns:cx="http://schemas.microsoft.com/office/drawing/2014/chartex" xmlns:mc="http://schemas.openxmlformats.org/markup-compatibility/2006" xmlns:o="urn:schemas-microsoft-com:office:office" xmlns:r="http://schemas.openxmlformats.org/officeDocument/2006/relationships" xmlns:m="http://schemas.openxmlformats.org/officeDocument/2006/math" xmlns:v="urn:schemas-microsoft-com:vml" xmlns:wp14="http://schemas.microsoft.com/office/word/2010/wordprocessingDrawing" xmlns:wp="http://schemas.openxmlformats.org/drawingml/2006/wordprocessingDrawing" xmlns:w10="urn:schemas-microsoft-com:office:word" xmlns:w="http://schemas.openxmlformats.org/wordprocessingml/2006/main" xmlns:w14="http://schemas.microsoft.com/office/word/2010/wordml" xmlns:w15="http://schemas.microsoft.com/office/word/2012/wordml" xmlns:w16se="http://schemas.microsoft.com/office/word/2015/wordml/symex" xmlns:wpg="http://schemas.microsoft.com/office/word/2010/wordprocessingGroup" xmlns:wpi="http://schemas.microsoft.com/office/word/2010/wordprocessingInk" xmlns:wne="http://schemas.microsoft.com/office/word/2006/wordml" xmlns:wps="http://schemas.microsoft.com/office/word/2010/wordprocessingShape" mc:Ignorable="w14 w15 w16se wp14">
   <w:body>
     <w:p>
       <w:pPr>
@@ -30,6 +30,7 @@
         </w:rPr>
         <w:t xml:space="preserve"> </w:t>
       </w:r>
+      <w:proofErr w:type="gramStart"/>
       <w:r>
         <w:rPr>
           <w:b/>
@@ -46,7 +47,17 @@
           <w:spacing w:val="-2"/>
           <w:sz w:val="26"/>
         </w:rPr>
-        <w:t>(no form)</w:t>
+        <w:t>(</w:t>
+      </w:r>
+      <w:proofErr w:type="gramEnd"/>
+      <w:r>
+        <w:rPr>
+          <w:b/>
+          <w:color w:val="000000" w:themeColor="text1"/>
+          <w:spacing w:val="-2"/>
+          <w:sz w:val="26"/>
+        </w:rPr>
+        <w:t>no form)</w:t>
       </w:r>
     </w:p>
     <w:p>
@@ -57,6 +68,7 @@
         <w:rPr>
           <w:b/>
           <w:color w:val="000000" w:themeColor="text1"/>
+          <w:spacing w:val="-5"/>
           <w:sz w:val="26"/>
         </w:rPr>
       </w:pPr>
@@ -119,6 +131,86 @@
           <w:sz w:val="26"/>
         </w:rPr>
         <w:t>I</w:t>
+      </w:r>
+    </w:p>
+    <w:p>
+      <w:pPr>
+        <w:tabs>
+          <w:tab w:val="left" w:leader="dot" w:pos="2500"/>
+        </w:tabs>
+        <w:spacing w:before="1"/>
+        <w:ind w:left="842"/>
+        <w:jc w:val="center"/>
+        <w:rPr>
+          <w:b/>
+          <w:sz w:val="26"/>
+        </w:rPr>
+      </w:pPr>
+      <w:bookmarkStart w:id="0" w:name="_GoBack"/>
+      <w:bookmarkEnd w:id="0"/>
+      <w:r>
+        <w:rPr>
+          <w:b/>
+          <w:spacing w:val="-4"/>
+          <w:sz w:val="26"/>
+        </w:rPr>
+        <w:t>(</w:t>
+      </w:r>
+      <w:proofErr w:type="spellStart"/>
+      <w:r>
+        <w:rPr>
+          <w:b/>
+          <w:color w:val="FF0000"/>
+          <w:spacing w:val="-4"/>
+          <w:sz w:val="26"/>
+        </w:rPr>
+        <w:t>kode</w:t>
+      </w:r>
+      <w:proofErr w:type="spellEnd"/>
+      <w:r>
+        <w:rPr>
+          <w:b/>
+          <w:color w:val="FF0000"/>
+          <w:spacing w:val="-4"/>
+          <w:sz w:val="26"/>
+        </w:rPr>
+        <w:t xml:space="preserve"> </w:t>
+      </w:r>
+      <w:proofErr w:type="spellStart"/>
+      <w:r>
+        <w:rPr>
+          <w:b/>
+          <w:color w:val="FF0000"/>
+          <w:spacing w:val="-4"/>
+          <w:sz w:val="26"/>
+        </w:rPr>
+        <w:t>mk</w:t>
+      </w:r>
+      <w:proofErr w:type="spellEnd"/>
+      <w:r>
+        <w:rPr>
+          <w:b/>
+          <w:spacing w:val="-4"/>
+          <w:sz w:val="26"/>
+        </w:rPr>
+        <w:t>)</w:t>
+      </w:r>
+      <w:r>
+        <w:rPr>
+          <w:b/>
+          <w:spacing w:val="-4"/>
+          <w:sz w:val="26"/>
+        </w:rPr>
+        <w:t xml:space="preserve"> </w:t>
+      </w:r>
+      <w:r>
+        <w:rPr>
+          <w:b/>
+          <w:color w:val="FF0000"/>
+          <w:spacing w:val="-4"/>
+          <w:sz w:val="26"/>
+        </w:rPr>
+        <w:t>SEMINAR KEMAJUAN I</w:t>
       </w:r>
     </w:p>
     <w:p>
@@ -244,6 +336,24 @@
               </w:rPr>
               <w:t/>
             </w:r>
+            <w:proofErr w:type="spellStart"/>
+            <w:r>
+              <w:rPr>
+                <w:rStyle w:val="fontstyle01"/>
+                <w:rFonts w:ascii="Times New Roman" w:hAnsi="Times New Roman" w:cs="Times New Roman"/>
+                <w:color w:val="000000" w:themeColor="text1"/>
+              </w:rPr>
+              <w:t/>
+            </w:r>
+            <w:proofErr w:type="spellEnd"/>
+            <w:r>
+              <w:rPr>
+                <w:rStyle w:val="fontstyle01"/>
+                <w:rFonts w:ascii="Times New Roman" w:hAnsi="Times New Roman" w:cs="Times New Roman"/>
+                <w:color w:val="000000" w:themeColor="text1"/>
+              </w:rPr>
+              <w:t/>
+            </w:r>
           </w:p>
         </w:tc>
       </w:tr>
@@ -490,6 +600,66 @@
               </w:rPr>
               <w:t/>
             </w:r>
+            <w:proofErr w:type="spellStart"/>
+            <w:r>
+              <w:rPr>
+                <w:color w:val="000000" w:themeColor="text1"/>
+                <w:sz w:val="24"/>
+                <w:szCs w:val="24"/>
+                <w:lang w:val="en-US"/>
+              </w:rPr>
+              <w:t/>
+            </w:r>
+            <w:proofErr w:type="spellEnd"/>
+            <w:r>
+              <w:rPr>
+                <w:color w:val="000000" w:themeColor="text1"/>
+                <w:sz w:val="24"/>
+                <w:szCs w:val="24"/>
+                <w:lang w:val="en-US"/>
+              </w:rPr>
+              <w:t xml:space="preserve"/>
+            </w:r>
+            <w:proofErr w:type="spellStart"/>
+            <w:r>
+              <w:rPr>
+                <w:color w:val="000000" w:themeColor="text1"/>
+                <w:sz w:val="24"/>
+                <w:szCs w:val="24"/>
+                <w:lang w:val="en-US"/>
+              </w:rPr>
+              <w:t/>
+            </w:r>
+            <w:proofErr w:type="spellEnd"/>
+            <w:r>
+              <w:rPr>
+                <w:color w:val="000000" w:themeColor="text1"/>
+                <w:sz w:val="24"/>
+                <w:szCs w:val="24"/>
+                <w:lang w:val="en-US"/>
+              </w:rPr>
+              <w:t xml:space="preserve"/>
+            </w:r>
+            <w:proofErr w:type="spellStart"/>
+            <w:r>
+              <w:rPr>
+                <w:color w:val="000000" w:themeColor="text1"/>
+                <w:sz w:val="24"/>
+                <w:szCs w:val="24"/>
+                <w:lang w:val="en-US"/>
+              </w:rPr>
+              <w:t/>
+            </w:r>
+            <w:proofErr w:type="spellEnd"/>
+            <w:r>
+              <w:rPr>
+                <w:color w:val="000000" w:themeColor="text1"/>
+                <w:sz w:val="24"/>
+                <w:szCs w:val="24"/>
+                <w:lang w:val="en-US"/>
+              </w:rPr>
+              <w:t/>
+            </w:r>
           </w:p>
           <w:p>
             <w:pPr>
@@ -585,6 +755,94 @@
               </w:rPr>
               <w:t/>
             </w:r>
+            <w:proofErr w:type="spellStart"/>
+            <w:r>
+              <w:rPr>
+                <w:color w:val="000000" w:themeColor="text1"/>
+                <w:spacing w:val="-10"/>
+                <w:sz w:val="24"/>
+                <w:szCs w:val="24"/>
+                <w:lang w:val="en-US"/>
+              </w:rPr>
+              <w:t/>
+            </w:r>
+            <w:proofErr w:type="spellEnd"/>
+            <w:r>
+              <w:rPr>
+                <w:color w:val="000000" w:themeColor="text1"/>
+                <w:spacing w:val="-10"/>
+                <w:sz w:val="24"/>
+                <w:szCs w:val="24"/>
+                <w:lang w:val="en-US"/>
+              </w:rPr>
+              <w:t xml:space="preserve"/>
+            </w:r>
+            <w:proofErr w:type="spellStart"/>
+            <w:r>
+              <w:rPr>
+                <w:color w:val="000000" w:themeColor="text1"/>
+                <w:spacing w:val="-10"/>
+                <w:sz w:val="24"/>
+                <w:szCs w:val="24"/>
+                <w:lang w:val="en-US"/>
+              </w:rPr>
+              <w:t/>
+            </w:r>
+            <w:proofErr w:type="spellEnd"/>
+            <w:r>
+              <w:rPr>
+                <w:color w:val="000000" w:themeColor="text1"/>
+                <w:spacing w:val="-10"/>
+                <w:sz w:val="24"/>
+                <w:szCs w:val="24"/>
+                <w:lang w:val="en-US"/>
+              </w:rPr>
+              <w:t xml:space="preserve"/>
+            </w:r>
+            <w:proofErr w:type="spellStart"/>
+            <w:r>
+              <w:rPr>
+                <w:color w:val="000000" w:themeColor="text1"/>
+                <w:spacing w:val="-10"/>
+                <w:sz w:val="24"/>
+                <w:szCs w:val="24"/>
+                <w:lang w:val="en-US"/>
+              </w:rPr>
+              <w:t/>
+            </w:r>
+            <w:proofErr w:type="spellEnd"/>
+            <w:r>
+              <w:rPr>
+                <w:color w:val="000000" w:themeColor="text1"/>
+                <w:spacing w:val="-10"/>
+                <w:sz w:val="24"/>
+                <w:szCs w:val="24"/>
+                <w:lang w:val="en-US"/>
+              </w:rPr>
+              <w:t xml:space="preserve"/>
+            </w:r>
+            <w:proofErr w:type="spellStart"/>
+            <w:r>
+              <w:rPr>
+                <w:color w:val="000000" w:themeColor="text1"/>
+                <w:spacing w:val="-10"/>
+                <w:sz w:val="24"/>
+                <w:szCs w:val="24"/>
+                <w:lang w:val="en-US"/>
+              </w:rPr>
+              <w:t/>
+            </w:r>
+            <w:proofErr w:type="spellEnd"/>
+            <w:r>
+              <w:rPr>
+                <w:color w:val="000000" w:themeColor="text1"/>
+                <w:spacing w:val="-10"/>
+                <w:sz w:val="24"/>
+                <w:szCs w:val="24"/>
+                <w:lang w:val="en-US"/>
+              </w:rPr>
+              <w:t/>
+            </w:r>
           </w:p>
           <w:p>
             <w:pPr>
@@ -699,6 +957,46 @@
               </w:rPr>
               <w:t/>
             </w:r>
+            <w:proofErr w:type="spellStart"/>
+            <w:r>
+              <w:rPr>
+                <w:color w:val="000000" w:themeColor="text1"/>
+                <w:sz w:val="24"/>
+                <w:szCs w:val="24"/>
+                <w:lang w:val="en-US"/>
+              </w:rPr>
+              <w:t/>
+            </w:r>
+            <w:proofErr w:type="spellEnd"/>
+            <w:r>
+              <w:rPr>
+                <w:color w:val="000000" w:themeColor="text1"/>
+                <w:sz w:val="24"/>
+                <w:szCs w:val="24"/>
+                <w:lang w:val="en-US"/>
+              </w:rPr>
+              <w:t xml:space="preserve"/>
+            </w:r>
+            <w:proofErr w:type="spellStart"/>
+            <w:r>
+              <w:rPr>
+                <w:color w:val="000000" w:themeColor="text1"/>
+                <w:sz w:val="24"/>
+                <w:szCs w:val="24"/>
+                <w:lang w:val="en-US"/>
+              </w:rPr>
+              <w:t/>
+            </w:r>
+            <w:proofErr w:type="spellEnd"/>
+            <w:r>
+              <w:rPr>
+                <w:color w:val="000000" w:themeColor="text1"/>
+                <w:sz w:val="24"/>
+                <w:szCs w:val="24"/>
+                <w:lang w:val="en-US"/>
+              </w:rPr>
+              <w:t xml:space="preserve"/>
+            </w:r>
           </w:p>
           <w:p>
             <w:pPr>
@@ -802,6 +1100,72 @@
               </w:rPr>
               <w:t/>
             </w:r>
+            <w:proofErr w:type="spellStart"/>
+            <w:r>
+              <w:rPr>
+                <w:color w:val="000000" w:themeColor="text1"/>
+                <w:spacing w:val="-10"/>
+                <w:sz w:val="24"/>
+                <w:szCs w:val="24"/>
+                <w:lang w:val="en-US"/>
+              </w:rPr>
+              <w:t/>
+            </w:r>
+            <w:proofErr w:type="spellEnd"/>
+            <w:r>
+              <w:rPr>
+                <w:color w:val="000000" w:themeColor="text1"/>
+                <w:spacing w:val="-10"/>
+                <w:sz w:val="24"/>
+                <w:szCs w:val="24"/>
+                <w:lang w:val="en-US"/>
+              </w:rPr>
+              <w:t xml:space="preserve"/>
+            </w:r>
+            <w:proofErr w:type="spellStart"/>
+            <w:r>
+              <w:rPr>
+                <w:color w:val="000000" w:themeColor="text1"/>
+                <w:spacing w:val="-10"/>
+                <w:sz w:val="24"/>
+                <w:szCs w:val="24"/>
+                <w:lang w:val="en-US"/>
+              </w:rPr>
+              <w:t/>
+            </w:r>
+            <w:proofErr w:type="spellEnd"/>
+            <w:r>
+              <w:rPr>
+                <w:color w:val="000000" w:themeColor="text1"/>
+                <w:spacing w:val="-10"/>
+                <w:sz w:val="24"/>
+                <w:szCs w:val="24"/>
+                <w:lang w:val="en-US"/>
+              </w:rPr>
+              <w:t xml:space="preserve"/>
+            </w:r>
+            <w:proofErr w:type="spellStart"/>
+            <w:r>
+              <w:rPr>
+                <w:color w:val="000000" w:themeColor="text1"/>
+                <w:spacing w:val="-10"/>
+                <w:sz w:val="24"/>
+                <w:szCs w:val="24"/>
+                <w:lang w:val="en-US"/>
+              </w:rPr>
+              <w:t/>
+            </w:r>
+            <w:proofErr w:type="spellEnd"/>
+            <w:r>
+              <w:rPr>
+                <w:color w:val="000000" w:themeColor="text1"/>
+                <w:spacing w:val="-10"/>
+                <w:sz w:val="24"/>
+                <w:szCs w:val="24"/>
+                <w:lang w:val="en-US"/>
+              </w:rPr>
+              <w:t xml:space="preserve"/>
+            </w:r>
             <w:r>
               <w:rPr>
                 <w:color w:val="000000" w:themeColor="text1"/>
@@ -914,6 +1278,46 @@
               </w:rPr>
               <w:t/>
             </w:r>
+            <w:proofErr w:type="spellStart"/>
+            <w:r>
+              <w:rPr>
+                <w:color w:val="000000" w:themeColor="text1"/>
+                <w:sz w:val="24"/>
+                <w:szCs w:val="24"/>
+                <w:lang w:val="en-US"/>
+              </w:rPr>
+              <w:t/>
+            </w:r>
+            <w:proofErr w:type="spellEnd"/>
+            <w:r>
+              <w:rPr>
+                <w:color w:val="000000" w:themeColor="text1"/>
+                <w:sz w:val="24"/>
+                <w:szCs w:val="24"/>
+                <w:lang w:val="en-US"/>
+              </w:rPr>
+              <w:t xml:space="preserve"/>
+            </w:r>
+            <w:proofErr w:type="spellStart"/>
+            <w:r>
+              <w:rPr>
+                <w:color w:val="000000" w:themeColor="text1"/>
+                <w:sz w:val="24"/>
+                <w:szCs w:val="24"/>
+                <w:lang w:val="en-US"/>
+              </w:rPr>
+              <w:t/>
+            </w:r>
+            <w:proofErr w:type="spellEnd"/>
+            <w:r>
+              <w:rPr>
+                <w:color w:val="000000" w:themeColor="text1"/>
+                <w:sz w:val="24"/>
+                <w:szCs w:val="24"/>
+                <w:lang w:val="en-US"/>
+              </w:rPr>
+              <w:t xml:space="preserve"/>
+            </w:r>
             <w:r>
               <w:rPr>
                 <w:color w:val="000000" w:themeColor="text1"/>
@@ -1016,6 +1420,72 @@
                 <w:lang w:val="en-US"/>
               </w:rPr>
               <w:t/>
+            </w:r>
+            <w:proofErr w:type="spellStart"/>
+            <w:r>
+              <w:rPr>
+                <w:color w:val="000000" w:themeColor="text1"/>
+                <w:spacing w:val="-10"/>
+                <w:sz w:val="24"/>
+                <w:szCs w:val="24"/>
+                <w:lang w:val="en-US"/>
+              </w:rPr>
+              <w:t/>
+            </w:r>
+            <w:proofErr w:type="spellEnd"/>
+            <w:r>
+              <w:rPr>
+                <w:color w:val="000000" w:themeColor="text1"/>
+                <w:spacing w:val="-10"/>
+                <w:sz w:val="24"/>
+                <w:szCs w:val="24"/>
+                <w:lang w:val="en-US"/>
+              </w:rPr>
+              <w:t xml:space="preserve"/>
+            </w:r>
+            <w:proofErr w:type="spellStart"/>
+            <w:r>
+              <w:rPr>
+                <w:color w:val="000000" w:themeColor="text1"/>
+                <w:spacing w:val="-10"/>
+                <w:sz w:val="24"/>
+                <w:szCs w:val="24"/>
+                <w:lang w:val="en-US"/>
+              </w:rPr>
+              <w:t/>
+            </w:r>
+            <w:proofErr w:type="spellEnd"/>
+            <w:r>
+              <w:rPr>
+                <w:color w:val="000000" w:themeColor="text1"/>
+                <w:spacing w:val="-10"/>
+                <w:sz w:val="24"/>
+                <w:szCs w:val="24"/>
+                <w:lang w:val="en-US"/>
+              </w:rPr>
+              <w:t xml:space="preserve"/>
+            </w:r>
+            <w:proofErr w:type="spellStart"/>
+            <w:r>
+              <w:rPr>
+                <w:color w:val="000000" w:themeColor="text1"/>
+                <w:spacing w:val="-10"/>
+                <w:sz w:val="24"/>
+                <w:szCs w:val="24"/>
+                <w:lang w:val="en-US"/>
+              </w:rPr>
+              <w:t/>
+            </w:r>
+            <w:proofErr w:type="spellEnd"/>
+            <w:r>
+              <w:rPr>
+                <w:color w:val="000000" w:themeColor="text1"/>
+                <w:spacing w:val="-10"/>
+                <w:sz w:val="24"/>
+                <w:szCs w:val="24"/>
+                <w:lang w:val="en-US"/>
+              </w:rPr>
+              <w:t xml:space="preserve"/>
             </w:r>
             <w:r>
               <w:rPr>
@@ -1109,6 +1579,46 @@
                 <w:szCs w:val="24"/>
                 <w:lang w:val="en-US"/>
               </w:rPr>
+              <w:t/>
+            </w:r>
+            <w:proofErr w:type="spellStart"/>
+            <w:r>
+              <w:rPr>
+                <w:color w:val="000000" w:themeColor="text1"/>
+                <w:sz w:val="24"/>
+                <w:szCs w:val="24"/>
+                <w:lang w:val="en-US"/>
+              </w:rPr>
+              <w:t/>
+            </w:r>
+            <w:proofErr w:type="spellEnd"/>
+            <w:r>
+              <w:rPr>
+                <w:color w:val="000000" w:themeColor="text1"/>
+                <w:sz w:val="24"/>
+                <w:szCs w:val="24"/>
+                <w:lang w:val="en-US"/>
+              </w:rPr>
+              <w:t xml:space="preserve"/>
+            </w:r>
+            <w:proofErr w:type="spellStart"/>
+            <w:r>
+              <w:rPr>
+                <w:color w:val="000000" w:themeColor="text1"/>
+                <w:sz w:val="24"/>
+                <w:szCs w:val="24"/>
+                <w:lang w:val="en-US"/>
+              </w:rPr>
+              <w:t/>
+            </w:r>
+            <w:proofErr w:type="spellEnd"/>
+            <w:r>
+              <w:rPr>
+                <w:color w:val="000000" w:themeColor="text1"/>
+                <w:sz w:val="24"/>
+                <w:szCs w:val="24"/>
+                <w:lang w:val="en-US"/>
+              </w:rPr>
               <w:t xml:space="preserve">      </w:t>
             </w:r>
             <w:r>
@@ -1129,6 +1639,50 @@
               </w:rPr>
               <w:t>${ruang_sidang}</w:t>
             </w:r>
+            <w:r>
+              <w:rPr>
+                <w:color w:val="000000" w:themeColor="text1"/>
+                <w:spacing w:val="-2"/>
+                <w:sz w:val="24"/>
+                <w:szCs w:val="24"/>
+                <w:lang w:val="en-US"/>
+              </w:rPr>
+              <w:t/>
+            </w:r>
+            <w:proofErr w:type="spellStart"/>
+            <w:r>
+              <w:rPr>
+                <w:color w:val="000000" w:themeColor="text1"/>
+                <w:spacing w:val="-2"/>
+                <w:sz w:val="24"/>
+                <w:szCs w:val="24"/>
+                <w:lang w:val="en-US"/>
+              </w:rPr>
+              <w:t/>
+            </w:r>
+            <w:proofErr w:type="spellEnd"/>
+            <w:r>
+              <w:rPr>
+                <w:color w:val="000000" w:themeColor="text1"/>
+                <w:spacing w:val="-2"/>
+                <w:sz w:val="24"/>
+                <w:szCs w:val="24"/>
+                <w:lang w:val="en-US"/>
+              </w:rPr>
+              <w:t xml:space="preserve"/>
+            </w:r>
+            <w:proofErr w:type="spellStart"/>
+            <w:r>
+              <w:rPr>
+                <w:color w:val="000000" w:themeColor="text1"/>
+                <w:spacing w:val="-2"/>
+                <w:sz w:val="24"/>
+                <w:szCs w:val="24"/>
+                <w:lang w:val="en-US"/>
+              </w:rPr>
+              <w:t/>
+            </w:r>
+            <w:proofErr w:type="spellEnd"/>
             <w:r>
               <w:rPr>
                 <w:color w:val="000000" w:themeColor="text1"/>
@@ -1425,6 +1979,26 @@
                 <w:sz w:val="24"/>
                 <w:lang w:val="en-US"/>
               </w:rPr>
+              <w:t xml:space="preserve"/>
+            </w:r>
+            <w:proofErr w:type="spellStart"/>
+            <w:r>
+              <w:rPr>
+                <w:b/>
+                <w:color w:val="000000" w:themeColor="text1"/>
+                <w:sz w:val="24"/>
+                <w:lang w:val="en-US"/>
+              </w:rPr>
+              <w:t/>
+            </w:r>
+            <w:proofErr w:type="spellEnd"/>
+            <w:r>
+              <w:rPr>
+                <w:b/>
+                <w:color w:val="000000" w:themeColor="text1"/>
+                <w:sz w:val="24"/>
+                <w:lang w:val="en-US"/>
+              </w:rPr>
               <w:t/>
             </w:r>
           </w:p>
@@ -1462,14 +2036,16 @@
               </w:rPr>
               <w:t>${keterangan}</w:t>
             </w:r>
-            <w:r>
-              <w:rPr>
-                <w:color w:val="000000" w:themeColor="text1"/>
-                <w:sz w:val="24"/>
-                <w:lang w:val="en-US"/>
-              </w:rPr>
-              <w:t/>
-            </w:r>
+            <w:proofErr w:type="spellStart"/>
+            <w:r>
+              <w:rPr>
+                <w:color w:val="000000" w:themeColor="text1"/>
+                <w:sz w:val="24"/>
+                <w:lang w:val="en-US"/>
+              </w:rPr>
+              <w:t/>
+            </w:r>
+            <w:proofErr w:type="spellEnd"/>
             <w:r>
               <w:rPr>
                 <w:color w:val="000000" w:themeColor="text1"/>
@@ -1510,6 +2086,7 @@
               </w:rPr>
               <w:t>${nilai}</w:t>
             </w:r>
+            <w:proofErr w:type="spellStart"/>
             <w:r>
               <w:rPr>
                 <w:b/>
@@ -1519,6 +2096,7 @@
               </w:rPr>
               <w:t/>
             </w:r>
+            <w:proofErr w:type="spellEnd"/>
             <w:r>
               <w:rPr>
                 <w:b/>
@@ -1561,6 +2139,26 @@
               </w:rPr>
               <w:t>${nama_penilaian}</w:t>
             </w:r>
+            <w:r>
+              <w:rPr>
+                <w:b/>
+                <w:color w:val="000000" w:themeColor="text1"/>
+                <w:sz w:val="24"/>
+                <w:lang w:val="en-US"/>
+              </w:rPr>
+              <w:t xml:space="preserve"/>
+            </w:r>
+            <w:proofErr w:type="spellStart"/>
+            <w:r>
+              <w:rPr>
+                <w:b/>
+                <w:color w:val="000000" w:themeColor="text1"/>
+                <w:sz w:val="24"/>
+                <w:lang w:val="en-US"/>
+              </w:rPr>
+              <w:t/>
+            </w:r>
+            <w:proofErr w:type="spellEnd"/>
             <w:r>
               <w:rPr>
                 <w:b/>
@@ -1607,14 +2205,16 @@
               </w:rPr>
               <w:t>${keterangan}</w:t>
             </w:r>
-            <w:r>
-              <w:rPr>
-                <w:color w:val="000000" w:themeColor="text1"/>
-                <w:sz w:val="24"/>
-                <w:lang w:val="en-US"/>
-              </w:rPr>
-              <w:t/>
-            </w:r>
+            <w:proofErr w:type="spellStart"/>
+            <w:r>
+              <w:rPr>
+                <w:color w:val="000000" w:themeColor="text1"/>
+                <w:sz w:val="24"/>
+                <w:lang w:val="en-US"/>
+              </w:rPr>
+              <w:t/>
+            </w:r>
+            <w:proofErr w:type="spellEnd"/>
             <w:r>
               <w:rPr>
                 <w:color w:val="000000" w:themeColor="text1"/>
@@ -1651,6 +2251,7 @@
               </w:rPr>
               <w:t>${nilai}</w:t>
             </w:r>
+            <w:proofErr w:type="spellStart"/>
             <w:r>
               <w:rPr>
                 <w:b/>
@@ -1660,6 +2261,7 @@
               </w:rPr>
               <w:t/>
             </w:r>
+            <w:proofErr w:type="spellEnd"/>
             <w:r>
               <w:rPr>
                 <w:b/>
@@ -1713,6 +2315,26 @@
                 <w:sz w:val="24"/>
                 <w:lang w:val="en-US"/>
               </w:rPr>
+              <w:t xml:space="preserve"/>
+            </w:r>
+            <w:proofErr w:type="spellStart"/>
+            <w:r>
+              <w:rPr>
+                <w:b/>
+                <w:color w:val="000000" w:themeColor="text1"/>
+                <w:sz w:val="24"/>
+                <w:lang w:val="en-US"/>
+              </w:rPr>
+              <w:t/>
+            </w:r>
+            <w:proofErr w:type="spellEnd"/>
+            <w:r>
+              <w:rPr>
+                <w:b/>
+                <w:color w:val="000000" w:themeColor="text1"/>
+                <w:sz w:val="24"/>
+                <w:lang w:val="en-US"/>
+              </w:rPr>
               <w:t/>
             </w:r>
           </w:p>
@@ -1749,14 +2371,16 @@
               </w:rPr>
               <w:t>${keterangan}</w:t>
             </w:r>
-            <w:r>
-              <w:rPr>
-                <w:color w:val="000000" w:themeColor="text1"/>
-                <w:sz w:val="24"/>
-                <w:lang w:val="en-US"/>
-              </w:rPr>
-              <w:t/>
-            </w:r>
+            <w:proofErr w:type="spellStart"/>
+            <w:r>
+              <w:rPr>
+                <w:color w:val="000000" w:themeColor="text1"/>
+                <w:sz w:val="24"/>
+                <w:lang w:val="en-US"/>
+              </w:rPr>
+              <w:t/>
+            </w:r>
+            <w:proofErr w:type="spellEnd"/>
             <w:r>
               <w:rPr>
                 <w:color w:val="000000" w:themeColor="text1"/>
@@ -1796,6 +2420,7 @@
               </w:rPr>
               <w:t>${nilai}</w:t>
             </w:r>
+            <w:proofErr w:type="spellStart"/>
             <w:r>
               <w:rPr>
                 <w:b/>
@@ -1805,6 +2430,7 @@
               </w:rPr>
               <w:t/>
             </w:r>
+            <w:proofErr w:type="spellEnd"/>
             <w:r>
               <w:rPr>
                 <w:b/>
@@ -1859,6 +2485,7 @@
         </w:rPr>
         <w:t>${tgl_create_penilaian}</w:t>
       </w:r>
+      <w:proofErr w:type="spellStart"/>
       <w:r>
         <w:rPr>
           <w:rFonts w:ascii="Times New Roman" w:hAnsi="Times New Roman" w:cs="Times New Roman"/>
@@ -1866,6 +2493,23 @@
         </w:rPr>
         <w:t/>
       </w:r>
+      <w:proofErr w:type="spellEnd"/>
+      <w:r>
+        <w:rPr>
+          <w:rFonts w:ascii="Times New Roman" w:hAnsi="Times New Roman" w:cs="Times New Roman"/>
+          <w:color w:val="000000" w:themeColor="text1"/>
+        </w:rPr>
+        <w:t xml:space="preserve"/>
+      </w:r>
+      <w:proofErr w:type="spellStart"/>
+      <w:r>
+        <w:rPr>
+          <w:rFonts w:ascii="Times New Roman" w:hAnsi="Times New Roman" w:cs="Times New Roman"/>
+          <w:color w:val="000000" w:themeColor="text1"/>
+        </w:rPr>
+        <w:t/>
+      </w:r>
+      <w:proofErr w:type="spellEnd"/>
       <w:r>
         <w:rPr>
           <w:rFonts w:ascii="Times New Roman" w:hAnsi="Times New Roman" w:cs="Times New Roman"/>
@@ -1920,6 +2564,7 @@
         </w:rPr>
         <w:t>${nama_penilai}</w:t>
       </w:r>
+      <w:proofErr w:type="spellStart"/>
       <w:r>
         <w:rPr>
           <w:rFonts w:ascii="Times New Roman" w:hAnsi="Times New Roman" w:cs="Times New Roman"/>
@@ -1944,6 +2589,7 @@
         </w:rPr>
         <w:t/>
       </w:r>
+      <w:proofErr w:type="spellEnd"/>
       <w:r>
         <w:rPr>
           <w:rFonts w:ascii="Times New Roman" w:hAnsi="Times New Roman" w:cs="Times New Roman"/>
@@ -1957,39 +2603,84 @@
       <w:pPr>
         <w:pStyle w:val="BodyText"/>
         <w:ind w:left="4950" w:right="854"/>
+      </w:pPr>
+      <w:r>
+        <w:rPr>
+          <w:rFonts w:ascii="Times New Roman" w:hAnsi="Times New Roman" w:cs="Times New Roman"/>
+        </w:rPr>
+        <w:t>(</w:t>
+      </w:r>
+      <w:proofErr w:type="spellStart"/>
+      <w:r>
+        <w:rPr>
+          <w:rFonts w:ascii="Times New Roman" w:hAnsi="Times New Roman" w:cs="Times New Roman"/>
+        </w:rPr>
+        <w:t>Penilai</w:t>
+      </w:r>
+      <w:proofErr w:type="spellEnd"/>
+      <w:r>
+        <w:rPr>
+          <w:rFonts w:ascii="Times New Roman" w:hAnsi="Times New Roman" w:cs="Times New Roman"/>
+          <w:spacing w:val="-4"/>
+        </w:rPr>
+        <w:t xml:space="preserve"> </w:t>
+      </w:r>
+      <w:r>
+        <w:rPr>
+          <w:rFonts w:ascii="Times New Roman" w:hAnsi="Times New Roman" w:cs="Times New Roman"/>
+          <w:color w:val="FF0000"/>
+        </w:rPr>
+        <w:t>Seminar</w:t>
+      </w:r>
+      <w:r>
+        <w:rPr>
+          <w:rFonts w:ascii="Times New Roman" w:hAnsi="Times New Roman" w:cs="Times New Roman"/>
+          <w:color w:val="FF0000"/>
+          <w:spacing w:val="-4"/>
+        </w:rPr>
+        <w:t xml:space="preserve"> </w:t>
+      </w:r>
+      <w:proofErr w:type="spellStart"/>
+      <w:r>
+        <w:rPr>
+          <w:rFonts w:ascii="Times New Roman" w:hAnsi="Times New Roman" w:cs="Times New Roman"/>
+          <w:color w:val="FF0000"/>
+        </w:rPr>
+        <w:t>Kemajuan</w:t>
+      </w:r>
+      <w:proofErr w:type="spellEnd"/>
+      <w:r>
+        <w:rPr>
+          <w:rFonts w:ascii="Times New Roman" w:hAnsi="Times New Roman" w:cs="Times New Roman"/>
+          <w:color w:val="FF0000"/>
+          <w:spacing w:val="-2"/>
+        </w:rPr>
+        <w:t xml:space="preserve"> </w:t>
+      </w:r>
+      <w:r>
+        <w:rPr>
+          <w:rFonts w:ascii="Times New Roman" w:hAnsi="Times New Roman" w:cs="Times New Roman"/>
+          <w:color w:val="FF0000"/>
+          <w:spacing w:val="-4"/>
+        </w:rPr>
+        <w:t>I</w:t>
+      </w:r>
+      <w:r>
+        <w:rPr>
+          <w:rFonts w:ascii="Times New Roman" w:hAnsi="Times New Roman" w:cs="Times New Roman"/>
+          <w:spacing w:val="-4"/>
+        </w:rPr>
+        <w:t>)</w:t>
+      </w:r>
+    </w:p>
+    <w:p>
+      <w:pPr>
+        <w:pStyle w:val="BodyText"/>
+        <w:ind w:left="4950" w:right="854"/>
         <w:rPr>
           <w:color w:val="000000" w:themeColor="text1"/>
         </w:rPr>
       </w:pPr>
-      <w:r>
-        <w:rPr>
-          <w:rFonts w:ascii="Times New Roman" w:hAnsi="Times New Roman" w:cs="Times New Roman"/>
-          <w:color w:val="000000" w:themeColor="text1"/>
-        </w:rPr>
-        <w:t>${nip_penilai}</w:t>
-      </w:r>
-      <w:r>
-        <w:rPr>
-          <w:rFonts w:ascii="Times New Roman" w:hAnsi="Times New Roman" w:cs="Times New Roman"/>
-          <w:color w:val="000000" w:themeColor="text1"/>
-        </w:rPr>
-        <w:t/>
-      </w:r>
-      <w:r>
-        <w:rPr>
-          <w:rFonts w:ascii="Times New Roman" w:hAnsi="Times New Roman" w:cs="Times New Roman"/>
-          <w:color w:val="000000" w:themeColor="text1"/>
-        </w:rPr>
-        <w:t/>
-      </w:r>
-      <w:r>
-        <w:rPr>
-          <w:rFonts w:ascii="Times New Roman" w:hAnsi="Times New Roman" w:cs="Times New Roman"/>
-          <w:color w:val="000000" w:themeColor="text1"/>
-          <w:spacing w:val="-4"/>
-        </w:rPr>
-        <w:t/>
-      </w:r>
     </w:p>
     <w:sectPr>
       <w:headerReference w:type="default" r:id="rId7"/>
@@ -2004,7 +2695,7 @@
 </file>
 
 <file path=word/endnotes.xml><?xml version="1.0" encoding="utf-8"?>
-<w:endnotes xmlns:wpc="http://schemas.microsoft.com/office/word/2010/wordprocessingCanvas" xmlns:cx="http://schemas.microsoft.com/office/drawing/2014/chartex" xmlns:cx1="http://schemas.microsoft.com/office/drawing/2015/9/8/chartex" xmlns:cx2="http://schemas.microsoft.com/office/drawing/2015/10/21/chartex" xmlns:cx3="http://schemas.microsoft.com/office/drawing/2016/5/9/chartex" xmlns:cx4="http://schemas.microsoft.com/office/drawing/2016/5/10/chartex" xmlns:cx5="http://schemas.microsoft.com/office/drawing/2016/5/11/chartex" xmlns:cx6="http://schemas.microsoft.com/office/drawing/2016/5/12/chartex" xmlns:cx7="http://schemas.microsoft.com/office/drawing/2016/5/13/chartex" xmlns:cx8="http://schemas.microsoft.com/office/drawing/2016/5/14/chartex" xmlns:mc="http://schemas.openxmlformats.org/markup-compatibility/2006" xmlns:aink="http://schemas.microsoft.com/office/drawing/2016/ink" xmlns:am3d="http://schemas.microsoft.com/office/drawing/2017/model3d" xmlns:o="urn:schemas-microsoft-com:office:office" xmlns:oel="http://schemas.microsoft.com/office/2019/extlst" xmlns:r="http://schemas.openxmlformats.org/officeDocument/2006/relationships" xmlns:m="http://schemas.openxmlformats.org/officeDocument/2006/math" xmlns:v="urn:schemas-microsoft-com:vml" xmlns:wp14="http://schemas.microsoft.com/office/word/2010/wordprocessingDrawing" xmlns:wp="http://schemas.openxmlformats.org/drawingml/2006/wordprocessingDrawing" xmlns:w10="urn:schemas-microsoft-com:office:word" xmlns:w="http://schemas.openxmlformats.org/wordprocessingml/2006/main" xmlns:w14="http://schemas.microsoft.com/office/word/2010/wordml" xmlns:w15="http://schemas.microsoft.com/office/word/2012/wordml" xmlns:w16cex="http://schemas.microsoft.com/office/word/2018/wordml/cex" xmlns:w16cid="http://schemas.microsoft.com/office/word/2016/wordml/cid" xmlns:w16="http://schemas.microsoft.com/office/word/2018/wordml" xmlns:w16du="http://schemas.microsoft.com/office/word/2023/wordml/word16du" xmlns:w16sdtdh="http://schemas.microsoft.com/office/word/2020/wordml/sdtdatahash" xmlns:w16sdtfl="http://schemas.microsoft.com/office/word/2024/wordml/sdtformatlock" xmlns:w16se="http://schemas.microsoft.com/office/word/2015/wordml/symex" xmlns:wpg="http://schemas.microsoft.com/office/word/2010/wordprocessingGroup" xmlns:wpi="http://schemas.microsoft.com/office/word/2010/wordprocessingInk" xmlns:wne="http://schemas.microsoft.com/office/word/2006/wordml" xmlns:wps="http://schemas.microsoft.com/office/word/2010/wordprocessingShape" mc:Ignorable="w14 w15 w16se w16cid w16 w16cex w16sdtdh w16sdtfl w16du wp14">
+<w:endnotes xmlns:wpc="http://schemas.microsoft.com/office/word/2010/wordprocessingCanvas" xmlns:cx="http://schemas.microsoft.com/office/drawing/2014/chartex" xmlns:mc="http://schemas.openxmlformats.org/markup-compatibility/2006" xmlns:o="urn:schemas-microsoft-com:office:office" xmlns:r="http://schemas.openxmlformats.org/officeDocument/2006/relationships" xmlns:m="http://schemas.openxmlformats.org/officeDocument/2006/math" xmlns:v="urn:schemas-microsoft-com:vml" xmlns:wp14="http://schemas.microsoft.com/office/word/2010/wordprocessingDrawing" xmlns:wp="http://schemas.openxmlformats.org/drawingml/2006/wordprocessingDrawing" xmlns:w10="urn:schemas-microsoft-com:office:word" xmlns:w="http://schemas.openxmlformats.org/wordprocessingml/2006/main" xmlns:w14="http://schemas.microsoft.com/office/word/2010/wordml" xmlns:w15="http://schemas.microsoft.com/office/word/2012/wordml" xmlns:w16se="http://schemas.microsoft.com/office/word/2015/wordml/symex" xmlns:wpg="http://schemas.microsoft.com/office/word/2010/wordprocessingGroup" xmlns:wpi="http://schemas.microsoft.com/office/word/2010/wordprocessingInk" xmlns:wne="http://schemas.microsoft.com/office/word/2006/wordml" xmlns:wps="http://schemas.microsoft.com/office/word/2010/wordprocessingShape" mc:Ignorable="w14 w15 w16se wp14">
   <w:endnote w:type="separator" w:id="-1">
     <w:p>
       <w:r>
@@ -2023,7 +2714,7 @@
 </file>
 
 <file path=word/footer1.xml><?xml version="1.0" encoding="utf-8"?>
-<w:ftr xmlns:wpc="http://schemas.microsoft.com/office/word/2010/wordprocessingCanvas" xmlns:cx="http://schemas.microsoft.com/office/drawing/2014/chartex" xmlns:cx1="http://schemas.microsoft.com/office/drawing/2015/9/8/chartex" xmlns:cx2="http://schemas.microsoft.com/office/drawing/2015/10/21/chartex" xmlns:cx3="http://schemas.microsoft.com/office/drawing/2016/5/9/chartex" xmlns:cx4="http://schemas.microsoft.com/office/drawing/2016/5/10/chartex" xmlns:cx5="http://schemas.microsoft.com/office/drawing/2016/5/11/chartex" xmlns:cx6="http://schemas.microsoft.com/office/drawing/2016/5/12/chartex" xmlns:cx7="http://schemas.microsoft.com/office/drawing/2016/5/13/chartex" xmlns:cx8="http://schemas.microsoft.com/office/drawing/2016/5/14/chartex" xmlns:mc="http://schemas.openxmlformats.org/markup-compatibility/2006" xmlns:aink="http://schemas.microsoft.com/office/drawing/2016/ink" xmlns:am3d="http://schemas.microsoft.com/office/drawing/2017/model3d" xmlns:o="urn:schemas-microsoft-com:office:office" xmlns:oel="http://schemas.microsoft.com/office/2019/extlst" xmlns:r="http://schemas.openxmlformats.org/officeDocument/2006/relationships" xmlns:m="http://schemas.openxmlformats.org/officeDocument/2006/math" xmlns:v="urn:schemas-microsoft-com:vml" xmlns:wp14="http://schemas.microsoft.com/office/word/2010/wordprocessingDrawing" xmlns:wp="http://schemas.openxmlformats.org/drawingml/2006/wordprocessingDrawing" xmlns:w10="urn:schemas-microsoft-com:office:word" xmlns:w="http://schemas.openxmlformats.org/wordprocessingml/2006/main" xmlns:w14="http://schemas.microsoft.com/office/word/2010/wordml" xmlns:w15="http://schemas.microsoft.com/office/word/2012/wordml" xmlns:w16cex="http://schemas.microsoft.com/office/word/2018/wordml/cex" xmlns:w16cid="http://schemas.microsoft.com/office/word/2016/wordml/cid" xmlns:w16="http://schemas.microsoft.com/office/word/2018/wordml" xmlns:w16du="http://schemas.microsoft.com/office/word/2023/wordml/word16du" xmlns:w16sdtdh="http://schemas.microsoft.com/office/word/2020/wordml/sdtdatahash" xmlns:w16sdtfl="http://schemas.microsoft.com/office/word/2024/wordml/sdtformatlock" xmlns:w16se="http://schemas.microsoft.com/office/word/2015/wordml/symex" xmlns:wpg="http://schemas.microsoft.com/office/word/2010/wordprocessingGroup" xmlns:wpi="http://schemas.microsoft.com/office/word/2010/wordprocessingInk" xmlns:wne="http://schemas.microsoft.com/office/word/2006/wordml" xmlns:wps="http://schemas.microsoft.com/office/word/2010/wordprocessingShape" mc:Ignorable="w14 w15 w16se w16cid w16 w16cex w16sdtdh w16sdtfl w16du wp14">
+<w:ftr xmlns:wpc="http://schemas.microsoft.com/office/word/2010/wordprocessingCanvas" xmlns:cx="http://schemas.microsoft.com/office/drawing/2014/chartex" xmlns:mc="http://schemas.openxmlformats.org/markup-compatibility/2006" xmlns:o="urn:schemas-microsoft-com:office:office" xmlns:r="http://schemas.openxmlformats.org/officeDocument/2006/relationships" xmlns:m="http://schemas.openxmlformats.org/officeDocument/2006/math" xmlns:v="urn:schemas-microsoft-com:vml" xmlns:wp14="http://schemas.microsoft.com/office/word/2010/wordprocessingDrawing" xmlns:wp="http://schemas.openxmlformats.org/drawingml/2006/wordprocessingDrawing" xmlns:w10="urn:schemas-microsoft-com:office:word" xmlns:w="http://schemas.openxmlformats.org/wordprocessingml/2006/main" xmlns:w14="http://schemas.microsoft.com/office/word/2010/wordml" xmlns:w15="http://schemas.microsoft.com/office/word/2012/wordml" xmlns:w16se="http://schemas.microsoft.com/office/word/2015/wordml/symex" xmlns:wpg="http://schemas.microsoft.com/office/word/2010/wordprocessingGroup" xmlns:wpi="http://schemas.microsoft.com/office/word/2010/wordprocessingInk" xmlns:wne="http://schemas.microsoft.com/office/word/2006/wordml" xmlns:wps="http://schemas.microsoft.com/office/word/2010/wordprocessingShape" mc:Ignorable="w14 w15 w16se wp14">
   <w:p>
     <w:pPr>
       <w:pStyle w:val="Footer"/>
@@ -2171,7 +2862,7 @@
             </wp:anchor>
           </w:drawing>
         </mc:Choice>
-        <mc:Fallback xmlns:w16cei="http://schemas.microsoft.com/office/word/2026/wordml/cei">
+        <mc:Fallback xmlns:w16cei="http://schemas.microsoft.com/office/word/2026/wordml/cei" xmlns:w16sdtfl="http://schemas.microsoft.com/office/word/2024/wordml/sdtformatlock" xmlns:w16sdtdh="http://schemas.microsoft.com/office/word/2020/wordml/sdtdatahash" xmlns:w16du="http://schemas.microsoft.com/office/word/2023/wordml/word16du" xmlns:w16="http://schemas.microsoft.com/office/word/2018/wordml" xmlns:w16cid="http://schemas.microsoft.com/office/word/2016/wordml/cid" xmlns:w16cex="http://schemas.microsoft.com/office/word/2018/wordml/cex" xmlns:oel="http://schemas.microsoft.com/office/2019/extlst" xmlns:am3d="http://schemas.microsoft.com/office/drawing/2017/model3d" xmlns:aink="http://schemas.microsoft.com/office/drawing/2016/ink" xmlns:cx8="http://schemas.microsoft.com/office/drawing/2016/5/14/chartex" xmlns:cx7="http://schemas.microsoft.com/office/drawing/2016/5/13/chartex" xmlns:cx6="http://schemas.microsoft.com/office/drawing/2016/5/12/chartex" xmlns:cx5="http://schemas.microsoft.com/office/drawing/2016/5/11/chartex" xmlns:cx4="http://schemas.microsoft.com/office/drawing/2016/5/10/chartex" xmlns:cx3="http://schemas.microsoft.com/office/drawing/2016/5/9/chartex" xmlns:cx2="http://schemas.microsoft.com/office/drawing/2015/10/21/chartex" xmlns:cx1="http://schemas.microsoft.com/office/drawing/2015/9/8/chartex">
           <w:pict>
             <v:line w14:anchorId="736FF723" id="Line 416" o:spid="_x0000_s1026" style="position:absolute;z-index:251666432;visibility:visible;mso-wrap-style:square;mso-width-percent:0;mso-height-percent:0;mso-wrap-distance-left:9pt;mso-wrap-distance-top:0;mso-wrap-distance-right:9pt;mso-wrap-distance-bottom:0;mso-position-horizontal:center;mso-position-horizontal-relative:margin;mso-position-vertical:absolute;mso-position-vertical-relative:text;mso-width-percent:0;mso-height-percent:0;mso-width-relative:page;mso-height-relative:page" from="0,-22.8pt" to="496.05pt,-22.8pt" o:gfxdata="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" strokecolor="#7f7f7f [1612]" strokeweight="1.5pt">
               <v:stroke joinstyle="miter"/>
@@ -2186,7 +2877,7 @@
 </file>
 
 <file path=word/footnotes.xml><?xml version="1.0" encoding="utf-8"?>
-<w:footnotes xmlns:wpc="http://schemas.microsoft.com/office/word/2010/wordprocessingCanvas" xmlns:cx="http://schemas.microsoft.com/office/drawing/2014/chartex" xmlns:cx1="http://schemas.microsoft.com/office/drawing/2015/9/8/chartex" xmlns:cx2="http://schemas.microsoft.com/office/drawing/2015/10/21/chartex" xmlns:cx3="http://schemas.microsoft.com/office/drawing/2016/5/9/chartex" xmlns:cx4="http://schemas.microsoft.com/office/drawing/2016/5/10/chartex" xmlns:cx5="http://schemas.microsoft.com/office/drawing/2016/5/11/chartex" xmlns:cx6="http://schemas.microsoft.com/office/drawing/2016/5/12/chartex" xmlns:cx7="http://schemas.microsoft.com/office/drawing/2016/5/13/chartex" xmlns:cx8="http://schemas.microsoft.com/office/drawing/2016/5/14/chartex" xmlns:mc="http://schemas.openxmlformats.org/markup-compatibility/2006" xmlns:aink="http://schemas.microsoft.com/office/drawing/2016/ink" xmlns:am3d="http://schemas.microsoft.com/office/drawing/2017/model3d" xmlns:o="urn:schemas-microsoft-com:office:office" xmlns:oel="http://schemas.microsoft.com/office/2019/extlst" xmlns:r="http://schemas.openxmlformats.org/officeDocument/2006/relationships" xmlns:m="http://schemas.openxmlformats.org/officeDocument/2006/math" xmlns:v="urn:schemas-microsoft-com:vml" xmlns:wp14="http://schemas.microsoft.com/office/word/2010/wordprocessingDrawing" xmlns:wp="http://schemas.openxmlformats.org/drawingml/2006/wordprocessingDrawing" xmlns:w10="urn:schemas-microsoft-com:office:word" xmlns:w="http://schemas.openxmlformats.org/wordprocessingml/2006/main" xmlns:w14="http://schemas.microsoft.com/office/word/2010/wordml" xmlns:w15="http://schemas.microsoft.com/office/word/2012/wordml" xmlns:w16cex="http://schemas.microsoft.com/office/word/2018/wordml/cex" xmlns:w16cid="http://schemas.microsoft.com/office/word/2016/wordml/cid" xmlns:w16="http://schemas.microsoft.com/office/word/2018/wordml" xmlns:w16du="http://schemas.microsoft.com/office/word/2023/wordml/word16du" xmlns:w16sdtdh="http://schemas.microsoft.com/office/word/2020/wordml/sdtdatahash" xmlns:w16sdtfl="http://schemas.microsoft.com/office/word/2024/wordml/sdtformatlock" xmlns:w16se="http://schemas.microsoft.com/office/word/2015/wordml/symex" xmlns:wpg="http://schemas.microsoft.com/office/word/2010/wordprocessingGroup" xmlns:wpi="http://schemas.microsoft.com/office/word/2010/wordprocessingInk" xmlns:wne="http://schemas.microsoft.com/office/word/2006/wordml" xmlns:wps="http://schemas.microsoft.com/office/word/2010/wordprocessingShape" mc:Ignorable="w14 w15 w16se w16cid w16 w16cex w16sdtdh w16sdtfl w16du wp14">
+<w:footnotes xmlns:wpc="http://schemas.microsoft.com/office/word/2010/wordprocessingCanvas" xmlns:cx="http://schemas.microsoft.com/office/drawing/2014/chartex" xmlns:mc="http://schemas.openxmlformats.org/markup-compatibility/2006" xmlns:o="urn:schemas-microsoft-com:office:office" xmlns:r="http://schemas.openxmlformats.org/officeDocument/2006/relationships" xmlns:m="http://schemas.openxmlformats.org/officeDocument/2006/math" xmlns:v="urn:schemas-microsoft-com:vml" xmlns:wp14="http://schemas.microsoft.com/office/word/2010/wordprocessingDrawing" xmlns:wp="http://schemas.openxmlformats.org/drawingml/2006/wordprocessingDrawing" xmlns:w10="urn:schemas-microsoft-com:office:word" xmlns:w="http://schemas.openxmlformats.org/wordprocessingml/2006/main" xmlns:w14="http://schemas.microsoft.com/office/word/2010/wordml" xmlns:w15="http://schemas.microsoft.com/office/word/2012/wordml" xmlns:w16se="http://schemas.microsoft.com/office/word/2015/wordml/symex" xmlns:wpg="http://schemas.microsoft.com/office/word/2010/wordprocessingGroup" xmlns:wpi="http://schemas.microsoft.com/office/word/2010/wordprocessingInk" xmlns:wne="http://schemas.microsoft.com/office/word/2006/wordml" xmlns:wps="http://schemas.microsoft.com/office/word/2010/wordprocessingShape" mc:Ignorable="w14 w15 w16se wp14">
   <w:footnote w:type="separator" w:id="-1">
     <w:p>
       <w:r>
@@ -2205,7 +2896,7 @@
 </file>
 
 <file path=word/header1.xml><?xml version="1.0" encoding="utf-8"?>
-<w:hdr xmlns:wpc="http://schemas.microsoft.com/office/word/2010/wordprocessingCanvas" xmlns:cx="http://schemas.microsoft.com/office/drawing/2014/chartex" xmlns:cx1="http://schemas.microsoft.com/office/drawing/2015/9/8/chartex" xmlns:cx2="http://schemas.microsoft.com/office/drawing/2015/10/21/chartex" xmlns:cx3="http://schemas.microsoft.com/office/drawing/2016/5/9/chartex" xmlns:cx4="http://schemas.microsoft.com/office/drawing/2016/5/10/chartex" xmlns:cx5="http://schemas.microsoft.com/office/drawing/2016/5/11/chartex" xmlns:cx6="http://schemas.microsoft.com/office/drawing/2016/5/12/chartex" xmlns:cx7="http://schemas.microsoft.com/office/drawing/2016/5/13/chartex" xmlns:cx8="http://schemas.microsoft.com/office/drawing/2016/5/14/chartex" xmlns:mc="http://schemas.openxmlformats.org/markup-compatibility/2006" xmlns:aink="http://schemas.microsoft.com/office/drawing/2016/ink" xmlns:am3d="http://schemas.microsoft.com/office/drawing/2017/model3d" xmlns:o="urn:schemas-microsoft-com:office:office" xmlns:oel="http://schemas.microsoft.com/office/2019/extlst" xmlns:r="http://schemas.openxmlformats.org/officeDocument/2006/relationships" xmlns:m="http://schemas.openxmlformats.org/officeDocument/2006/math" xmlns:v="urn:schemas-microsoft-com:vml" xmlns:wp14="http://schemas.microsoft.com/office/word/2010/wordprocessingDrawing" xmlns:wp="http://schemas.openxmlformats.org/drawingml/2006/wordprocessingDrawing" xmlns:w10="urn:schemas-microsoft-com:office:word" xmlns:w="http://schemas.openxmlformats.org/wordprocessingml/2006/main" xmlns:w14="http://schemas.microsoft.com/office/word/2010/wordml" xmlns:w15="http://schemas.microsoft.com/office/word/2012/wordml" xmlns:w16cex="http://schemas.microsoft.com/office/word/2018/wordml/cex" xmlns:w16cid="http://schemas.microsoft.com/office/word/2016/wordml/cid" xmlns:w16="http://schemas.microsoft.com/office/word/2018/wordml" xmlns:w16du="http://schemas.microsoft.com/office/word/2023/wordml/word16du" xmlns:w16sdtdh="http://schemas.microsoft.com/office/word/2020/wordml/sdtdatahash" xmlns:w16sdtfl="http://schemas.microsoft.com/office/word/2024/wordml/sdtformatlock" xmlns:w16se="http://schemas.microsoft.com/office/word/2015/wordml/symex" xmlns:wpg="http://schemas.microsoft.com/office/word/2010/wordprocessingGroup" xmlns:wpi="http://schemas.microsoft.com/office/word/2010/wordprocessingInk" xmlns:wne="http://schemas.microsoft.com/office/word/2006/wordml" xmlns:wps="http://schemas.microsoft.com/office/word/2010/wordprocessingShape" mc:Ignorable="w14 w15 w16se w16cid w16 w16cex w16sdtdh w16sdtfl w16du wp14">
+<w:hdr xmlns:wpc="http://schemas.microsoft.com/office/word/2010/wordprocessingCanvas" xmlns:cx="http://schemas.microsoft.com/office/drawing/2014/chartex" xmlns:mc="http://schemas.openxmlformats.org/markup-compatibility/2006" xmlns:o="urn:schemas-microsoft-com:office:office" xmlns:r="http://schemas.openxmlformats.org/officeDocument/2006/relationships" xmlns:m="http://schemas.openxmlformats.org/officeDocument/2006/math" xmlns:v="urn:schemas-microsoft-com:vml" xmlns:wp14="http://schemas.microsoft.com/office/word/2010/wordprocessingDrawing" xmlns:wp="http://schemas.openxmlformats.org/drawingml/2006/wordprocessingDrawing" xmlns:w10="urn:schemas-microsoft-com:office:word" xmlns:w="http://schemas.openxmlformats.org/wordprocessingml/2006/main" xmlns:w14="http://schemas.microsoft.com/office/word/2010/wordml" xmlns:w15="http://schemas.microsoft.com/office/word/2012/wordml" xmlns:w16se="http://schemas.microsoft.com/office/word/2015/wordml/symex" xmlns:wpg="http://schemas.microsoft.com/office/word/2010/wordprocessingGroup" xmlns:wpi="http://schemas.microsoft.com/office/word/2010/wordprocessingInk" xmlns:wne="http://schemas.microsoft.com/office/word/2006/wordml" xmlns:wps="http://schemas.microsoft.com/office/word/2010/wordprocessingShape" mc:Ignorable="w14 w15 w16se wp14">
   <w:tbl>
     <w:tblPr>
       <w:tblW w:w="9957" w:type="dxa"/>
@@ -2495,7 +3186,7 @@
             </wp:anchor>
           </w:drawing>
         </mc:Choice>
-        <mc:Fallback xmlns:w16cei="http://schemas.microsoft.com/office/word/2026/wordml/cei">
+        <mc:Fallback xmlns:w16cei="http://schemas.microsoft.com/office/word/2026/wordml/cei" xmlns:w16sdtfl="http://schemas.microsoft.com/office/word/2024/wordml/sdtformatlock" xmlns:w16sdtdh="http://schemas.microsoft.com/office/word/2020/wordml/sdtdatahash" xmlns:w16du="http://schemas.microsoft.com/office/word/2023/wordml/word16du" xmlns:w16="http://schemas.microsoft.com/office/word/2018/wordml" xmlns:w16cid="http://schemas.microsoft.com/office/word/2016/wordml/cid" xmlns:w16cex="http://schemas.microsoft.com/office/word/2018/wordml/cex" xmlns:oel="http://schemas.microsoft.com/office/2019/extlst" xmlns:am3d="http://schemas.microsoft.com/office/drawing/2017/model3d" xmlns:aink="http://schemas.microsoft.com/office/drawing/2016/ink" xmlns:cx8="http://schemas.microsoft.com/office/drawing/2016/5/14/chartex" xmlns:cx7="http://schemas.microsoft.com/office/drawing/2016/5/13/chartex" xmlns:cx6="http://schemas.microsoft.com/office/drawing/2016/5/12/chartex" xmlns:cx5="http://schemas.microsoft.com/office/drawing/2016/5/11/chartex" xmlns:cx4="http://schemas.microsoft.com/office/drawing/2016/5/10/chartex" xmlns:cx3="http://schemas.microsoft.com/office/drawing/2016/5/9/chartex" xmlns:cx2="http://schemas.microsoft.com/office/drawing/2015/10/21/chartex" xmlns:cx1="http://schemas.microsoft.com/office/drawing/2015/9/8/chartex">
           <w:pict>
             <v:line w14:anchorId="1F9328B4" id="Line 416" o:spid="_x0000_s1026" style="position:absolute;z-index:251664384;visibility:visible;mso-wrap-style:square;mso-width-percent:0;mso-height-percent:0;mso-wrap-distance-left:9pt;mso-wrap-distance-top:0;mso-wrap-distance-right:9pt;mso-wrap-distance-bottom:0;mso-position-horizontal:absolute;mso-position-horizontal-relative:margin;mso-position-vertical:absolute;mso-position-vertical-relative:text;mso-width-percent:0;mso-height-percent:0;mso-width-relative:page;mso-height-relative:page" from="-24.1pt,2.65pt" to="471.95pt,2.65pt" o:gfxdata="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" strokeweight="3.75pt">
               <v:stroke linestyle="thinThick"/>
@@ -2510,7 +3201,7 @@
 </file>
 
 <file path=word/numbering.xml><?xml version="1.0" encoding="utf-8"?>
-<w:numbering xmlns:wpc="http://schemas.microsoft.com/office/word/2010/wordprocessingCanvas" xmlns:cx="http://schemas.microsoft.com/office/drawing/2014/chartex" xmlns:cx1="http://schemas.microsoft.com/office/drawing/2015/9/8/chartex" xmlns:cx2="http://schemas.microsoft.com/office/drawing/2015/10/21/chartex" xmlns:cx3="http://schemas.microsoft.com/office/drawing/2016/5/9/chartex" xmlns:cx4="http://schemas.microsoft.com/office/drawing/2016/5/10/chartex" xmlns:cx5="http://schemas.microsoft.com/office/drawing/2016/5/11/chartex" xmlns:cx6="http://schemas.microsoft.com/office/drawing/2016/5/12/chartex" xmlns:cx7="http://schemas.microsoft.com/office/drawing/2016/5/13/chartex" xmlns:cx8="http://schemas.microsoft.com/office/drawing/2016/5/14/chartex" xmlns:mc="http://schemas.openxmlformats.org/markup-compatibility/2006" xmlns:aink="http://schemas.microsoft.com/office/drawing/2016/ink" xmlns:am3d="http://schemas.microsoft.com/office/drawing/2017/model3d" xmlns:o="urn:schemas-microsoft-com:office:office" xmlns:oel="http://schemas.microsoft.com/office/2019/extlst" xmlns:r="http://schemas.openxmlformats.org/officeDocument/2006/relationships" xmlns:m="http://schemas.openxmlformats.org/officeDocument/2006/math" xmlns:v="urn:schemas-microsoft-com:vml" xmlns:wp14="http://schemas.microsoft.com/office/word/2010/wordprocessingDrawing" xmlns:wp="http://schemas.openxmlformats.org/drawingml/2006/wordprocessingDrawing" xmlns:w10="urn:schemas-microsoft-com:office:word" xmlns:w="http://schemas.openxmlformats.org/wordprocessingml/2006/main" xmlns:w14="http://schemas.microsoft.com/office/word/2010/wordml" xmlns:w15="http://schemas.microsoft.com/office/word/2012/wordml" xmlns:w16cex="http://schemas.microsoft.com/office/word/2018/wordml/cex" xmlns:w16cid="http://schemas.microsoft.com/office/word/2016/wordml/cid" xmlns:w16="http://schemas.microsoft.com/office/word/2018/wordml" xmlns:w16du="http://schemas.microsoft.com/office/word/2023/wordml/word16du" xmlns:w16sdtdh="http://schemas.microsoft.com/office/word/2020/wordml/sdtdatahash" xmlns:w16sdtfl="http://schemas.microsoft.com/office/word/2024/wordml/sdtformatlock" xmlns:w16se="http://schemas.microsoft.com/office/word/2015/wordml/symex" xmlns:wpg="http://schemas.microsoft.com/office/word/2010/wordprocessingGroup" xmlns:wpi="http://schemas.microsoft.com/office/word/2010/wordprocessingInk" xmlns:wne="http://schemas.microsoft.com/office/word/2006/wordml" xmlns:wps="http://schemas.microsoft.com/office/word/2010/wordprocessingShape" mc:Ignorable="w14 w15 w16se w16cid w16 w16cex w16sdtdh w16sdtfl w16du wp14">
+<w:numbering xmlns:wpc="http://schemas.microsoft.com/office/word/2010/wordprocessingCanvas" xmlns:cx="http://schemas.microsoft.com/office/drawing/2014/chartex" xmlns:mc="http://schemas.openxmlformats.org/markup-compatibility/2006" xmlns:o="urn:schemas-microsoft-com:office:office" xmlns:r="http://schemas.openxmlformats.org/officeDocument/2006/relationships" xmlns:m="http://schemas.openxmlformats.org/officeDocument/2006/math" xmlns:v="urn:schemas-microsoft-com:vml" xmlns:wp14="http://schemas.microsoft.com/office/word/2010/wordprocessingDrawing" xmlns:wp="http://schemas.openxmlformats.org/drawingml/2006/wordprocessingDrawing" xmlns:w10="urn:schemas-microsoft-com:office:word" xmlns:w="http://schemas.openxmlformats.org/wordprocessingml/2006/main" xmlns:w14="http://schemas.microsoft.com/office/word/2010/wordml" xmlns:w15="http://schemas.microsoft.com/office/word/2012/wordml" xmlns:w16se="http://schemas.microsoft.com/office/word/2015/wordml/symex" xmlns:wpg="http://schemas.microsoft.com/office/word/2010/wordprocessingGroup" xmlns:wpi="http://schemas.microsoft.com/office/word/2010/wordprocessingInk" xmlns:wne="http://schemas.microsoft.com/office/word/2006/wordml" xmlns:wps="http://schemas.microsoft.com/office/word/2010/wordprocessingShape" mc:Ignorable="w14 w15 w16se wp14">
   <w:abstractNum w:abstractNumId="0" w15:restartNumberingAfterBreak="0">
     <w:nsid w:val="531B6706"/>
     <w:multiLevelType w:val="hybridMultilevel"/>
@@ -2624,14 +3315,14 @@
       </w:rPr>
     </w:lvl>
   </w:abstractNum>
-  <w:num w:numId="1" w16cid:durableId="1376269474">
+  <w:num w:numId="1">
     <w:abstractNumId w:val="0"/>
   </w:num>
 </w:numbering>
 </file>
 
 <file path=word/styles.xml><?xml version="1.0" encoding="utf-8"?>
-<w:styles xmlns:mc="http://schemas.openxmlformats.org/markup-compatibility/2006" xmlns:r="http://schemas.openxmlformats.org/officeDocument/2006/relationships" xmlns:w="http://schemas.openxmlformats.org/wordprocessingml/2006/main" xmlns:w14="http://schemas.microsoft.com/office/word/2010/wordml" xmlns:w15="http://schemas.microsoft.com/office/word/2012/wordml" xmlns:w16cex="http://schemas.microsoft.com/office/word/2018/wordml/cex" xmlns:w16cid="http://schemas.microsoft.com/office/word/2016/wordml/cid" xmlns:w16="http://schemas.microsoft.com/office/word/2018/wordml" xmlns:w16du="http://schemas.microsoft.com/office/word/2023/wordml/word16du" xmlns:w16sdtdh="http://schemas.microsoft.com/office/word/2020/wordml/sdtdatahash" xmlns:w16sdtfl="http://schemas.microsoft.com/office/word/2024/wordml/sdtformatlock" xmlns:w16se="http://schemas.microsoft.com/office/word/2015/wordml/symex" mc:Ignorable="w14 w15 w16se w16cid w16 w16cex w16sdtdh w16sdtfl w16du">
+<w:styles xmlns:mc="http://schemas.openxmlformats.org/markup-compatibility/2006" xmlns:r="http://schemas.openxmlformats.org/officeDocument/2006/relationships" xmlns:w="http://schemas.openxmlformats.org/wordprocessingml/2006/main" xmlns:w14="http://schemas.microsoft.com/office/word/2010/wordml" xmlns:w15="http://schemas.microsoft.com/office/word/2012/wordml" xmlns:w16se="http://schemas.microsoft.com/office/word/2015/wordml/symex" mc:Ignorable="w14 w15 w16se">
   <w:docDefaults>
     <w:rPrDefault>
       <w:rPr>
@@ -2647,7 +3338,7 @@
       </w:pPr>
     </w:pPrDefault>
   </w:docDefaults>
-  <w:latentStyles w:defLockedState="0" w:defUIPriority="99" w:defSemiHidden="0" w:defUnhideWhenUsed="0" w:defQFormat="0" w:count="376">
+  <w:latentStyles w:defLockedState="0" w:defUIPriority="99" w:defSemiHidden="0" w:defUnhideWhenUsed="0" w:defQFormat="0" w:count="371">
     <w:lsdException w:name="Normal" w:uiPriority="0" w:qFormat="1"/>
     <w:lsdException w:name="heading 1" w:uiPriority="9" w:qFormat="1"/>
     <w:lsdException w:name="heading 2" w:semiHidden="1" w:uiPriority="9" w:unhideWhenUsed="1" w:qFormat="1"/>
@@ -3019,11 +3710,6 @@
     <w:lsdException w:name="List Table 5 Dark Accent 6" w:uiPriority="50"/>
     <w:lsdException w:name="List Table 6 Colorful Accent 6" w:uiPriority="51"/>
     <w:lsdException w:name="List Table 7 Colorful Accent 6" w:uiPriority="52"/>
-    <w:lsdException w:name="Mention" w:semiHidden="1" w:unhideWhenUsed="1"/>
-    <w:lsdException w:name="Smart Hyperlink" w:semiHidden="1" w:unhideWhenUsed="1"/>
-    <w:lsdException w:name="Hashtag" w:semiHidden="1" w:unhideWhenUsed="1"/>
-    <w:lsdException w:name="Unresolved Mention" w:semiHidden="1" w:unhideWhenUsed="1"/>
-    <w:lsdException w:name="Smart Link" w:semiHidden="1" w:unhideWhenUsed="1"/>
   </w:latentStyles>
   <w:style w:type="paragraph" w:default="1" w:styleId="Normal">
     <w:name w:val="Normal"/>

</xml_diff>